<commit_message>
bonne mise en place des fichiers
</commit_message>
<xml_diff>
--- a/documentation/GUIDE UTILISATEUR COMPLET.docx
+++ b/documentation/GUIDE UTILISATEUR COMPLET.docx
@@ -4783,6 +4783,14 @@
         </w:rPr>
         <w:t>Le bouton de sauvegarde permet de lancer une sauvegarde de la base de données.</w:t>
       </w:r>
+      <w:r>
+        <w:rPr>
+          <w:rFonts w:ascii="Times New Roman" w:hAnsi="Times New Roman" w:cs="Times New Roman"/>
+          <w:sz w:val="24"/>
+          <w:szCs w:val="24"/>
+        </w:rPr>
+        <w:t xml:space="preserve"> </w:t>
+      </w:r>
     </w:p>
     <w:p>
       <w:pPr>
@@ -5502,25 +5510,7 @@
           <w:sz w:val="24"/>
           <w:szCs w:val="24"/>
         </w:rPr>
-        <w:t>2. Sélectionner un fichier `.xlsx`, `.</w:t>
-      </w:r>
-      <w:proofErr w:type="spellStart"/>
-      <w:r>
-        <w:rPr>
-          <w:rFonts w:ascii="Times New Roman" w:hAnsi="Times New Roman" w:cs="Times New Roman"/>
-          <w:sz w:val="24"/>
-          <w:szCs w:val="24"/>
-        </w:rPr>
-        <w:t>xls</w:t>
-      </w:r>
-      <w:proofErr w:type="spellEnd"/>
-      <w:r>
-        <w:rPr>
-          <w:rFonts w:ascii="Times New Roman" w:hAnsi="Times New Roman" w:cs="Times New Roman"/>
-          <w:sz w:val="24"/>
-          <w:szCs w:val="24"/>
-        </w:rPr>
-        <w:t>` ou `.csv`.</w:t>
+        <w:t>2. Sélectionner un fichier `.xlsx`, `.xls` ou `.csv`.</w:t>
       </w:r>
     </w:p>
     <w:p>
@@ -8247,19 +8237,24 @@
     </w:p>
     <w:p>
       <w:pPr>
-        <w:rPr>
-          <w:rFonts w:ascii="Times New Roman" w:hAnsi="Times New Roman" w:cs="Times New Roman"/>
-          <w:sz w:val="24"/>
-          <w:szCs w:val="24"/>
-        </w:rPr>
-      </w:pPr>
-      <w:r>
-        <w:rPr>
-          <w:rFonts w:ascii="Times New Roman" w:hAnsi="Times New Roman" w:cs="Times New Roman"/>
-          <w:sz w:val="24"/>
-          <w:szCs w:val="24"/>
-        </w:rPr>
-        <w:t xml:space="preserve"> Identifiants incorrects</w:t>
+        <w:pStyle w:val="Paragraphedeliste"/>
+        <w:numPr>
+          <w:ilvl w:val="0"/>
+          <w:numId w:val="7"/>
+        </w:numPr>
+        <w:rPr>
+          <w:rFonts w:ascii="Times New Roman" w:hAnsi="Times New Roman" w:cs="Times New Roman"/>
+          <w:sz w:val="24"/>
+          <w:szCs w:val="24"/>
+        </w:rPr>
+      </w:pPr>
+      <w:r>
+        <w:rPr>
+          <w:rFonts w:ascii="Times New Roman" w:hAnsi="Times New Roman" w:cs="Times New Roman"/>
+          <w:sz w:val="24"/>
+          <w:szCs w:val="24"/>
+        </w:rPr>
+        <w:t>Identifiants incorrects</w:t>
       </w:r>
     </w:p>
     <w:p>
@@ -8281,19 +8276,24 @@
     </w:p>
     <w:p>
       <w:pPr>
-        <w:rPr>
-          <w:rFonts w:ascii="Times New Roman" w:hAnsi="Times New Roman" w:cs="Times New Roman"/>
-          <w:sz w:val="24"/>
-          <w:szCs w:val="24"/>
-        </w:rPr>
-      </w:pPr>
-      <w:r>
-        <w:rPr>
-          <w:rFonts w:ascii="Times New Roman" w:hAnsi="Times New Roman" w:cs="Times New Roman"/>
-          <w:sz w:val="24"/>
-          <w:szCs w:val="24"/>
-        </w:rPr>
-        <w:t xml:space="preserve"> Impossible de contacter le serveur</w:t>
+        <w:pStyle w:val="Paragraphedeliste"/>
+        <w:numPr>
+          <w:ilvl w:val="0"/>
+          <w:numId w:val="7"/>
+        </w:numPr>
+        <w:rPr>
+          <w:rFonts w:ascii="Times New Roman" w:hAnsi="Times New Roman" w:cs="Times New Roman"/>
+          <w:sz w:val="24"/>
+          <w:szCs w:val="24"/>
+        </w:rPr>
+      </w:pPr>
+      <w:r>
+        <w:rPr>
+          <w:rFonts w:ascii="Times New Roman" w:hAnsi="Times New Roman" w:cs="Times New Roman"/>
+          <w:sz w:val="24"/>
+          <w:szCs w:val="24"/>
+        </w:rPr>
+        <w:t>Impossible de contacter le serveur</w:t>
       </w:r>
     </w:p>
     <w:p>
@@ -8315,19 +8315,24 @@
     </w:p>
     <w:p>
       <w:pPr>
-        <w:rPr>
-          <w:rFonts w:ascii="Times New Roman" w:hAnsi="Times New Roman" w:cs="Times New Roman"/>
-          <w:sz w:val="24"/>
-          <w:szCs w:val="24"/>
-        </w:rPr>
-      </w:pPr>
-      <w:r>
-        <w:rPr>
-          <w:rFonts w:ascii="Times New Roman" w:hAnsi="Times New Roman" w:cs="Times New Roman"/>
-          <w:sz w:val="24"/>
-          <w:szCs w:val="24"/>
-        </w:rPr>
-        <w:t xml:space="preserve"> Mot de passe invalide</w:t>
+        <w:pStyle w:val="Paragraphedeliste"/>
+        <w:numPr>
+          <w:ilvl w:val="0"/>
+          <w:numId w:val="7"/>
+        </w:numPr>
+        <w:rPr>
+          <w:rFonts w:ascii="Times New Roman" w:hAnsi="Times New Roman" w:cs="Times New Roman"/>
+          <w:sz w:val="24"/>
+          <w:szCs w:val="24"/>
+        </w:rPr>
+      </w:pPr>
+      <w:r>
+        <w:rPr>
+          <w:rFonts w:ascii="Times New Roman" w:hAnsi="Times New Roman" w:cs="Times New Roman"/>
+          <w:sz w:val="24"/>
+          <w:szCs w:val="24"/>
+        </w:rPr>
+        <w:t>Mot de passe invalide</w:t>
       </w:r>
     </w:p>
     <w:p>
@@ -8349,19 +8354,24 @@
     </w:p>
     <w:p>
       <w:pPr>
-        <w:rPr>
-          <w:rFonts w:ascii="Times New Roman" w:hAnsi="Times New Roman" w:cs="Times New Roman"/>
-          <w:sz w:val="24"/>
-          <w:szCs w:val="24"/>
-        </w:rPr>
-      </w:pPr>
-      <w:r>
-        <w:rPr>
-          <w:rFonts w:ascii="Times New Roman" w:hAnsi="Times New Roman" w:cs="Times New Roman"/>
-          <w:sz w:val="24"/>
-          <w:szCs w:val="24"/>
-        </w:rPr>
-        <w:t xml:space="preserve"> Suppression impossible</w:t>
+        <w:pStyle w:val="Paragraphedeliste"/>
+        <w:numPr>
+          <w:ilvl w:val="0"/>
+          <w:numId w:val="7"/>
+        </w:numPr>
+        <w:rPr>
+          <w:rFonts w:ascii="Times New Roman" w:hAnsi="Times New Roman" w:cs="Times New Roman"/>
+          <w:sz w:val="24"/>
+          <w:szCs w:val="24"/>
+        </w:rPr>
+      </w:pPr>
+      <w:r>
+        <w:rPr>
+          <w:rFonts w:ascii="Times New Roman" w:hAnsi="Times New Roman" w:cs="Times New Roman"/>
+          <w:sz w:val="24"/>
+          <w:szCs w:val="24"/>
+        </w:rPr>
+        <w:t>Suppression impossible</w:t>
       </w:r>
     </w:p>
     <w:p>
@@ -8391,17 +8401,6 @@
           <w:szCs w:val="24"/>
         </w:rPr>
       </w:pPr>
-    </w:p>
-    <w:p>
-      <w:pPr>
-        <w:rPr>
-          <w:rFonts w:ascii="Times New Roman" w:hAnsi="Times New Roman" w:cs="Times New Roman"/>
-          <w:b/>
-          <w:bCs/>
-          <w:sz w:val="24"/>
-          <w:szCs w:val="24"/>
-        </w:rPr>
-      </w:pPr>
       <w:r>
         <w:rPr>
           <w:rFonts w:ascii="Times New Roman" w:hAnsi="Times New Roman" w:cs="Times New Roman"/>
@@ -8436,6 +8435,1390 @@
           <w:rFonts w:ascii="Times New Roman" w:hAnsi="Times New Roman" w:cs="Times New Roman"/>
           <w:b/>
           <w:bCs/>
+          <w:sz w:val="24"/>
+          <w:szCs w:val="24"/>
+        </w:rPr>
+      </w:pPr>
+      <w:r>
+        <w:rPr>
+          <w:rFonts w:ascii="Times New Roman" w:hAnsi="Times New Roman" w:cs="Times New Roman"/>
+          <w:b/>
+          <w:bCs/>
+          <w:sz w:val="24"/>
+          <w:szCs w:val="24"/>
+        </w:rPr>
+        <w:t>12.installation</w:t>
+      </w:r>
+    </w:p>
+    <w:p>
+      <w:pPr>
+        <w:rPr>
+          <w:rFonts w:ascii="Times New Roman" w:hAnsi="Times New Roman" w:cs="Times New Roman"/>
+          <w:sz w:val="24"/>
+          <w:szCs w:val="24"/>
+        </w:rPr>
+      </w:pPr>
+      <w:r>
+        <w:rPr>
+          <w:rFonts w:ascii="Times New Roman" w:hAnsi="Times New Roman" w:cs="Times New Roman"/>
+          <w:b/>
+          <w:bCs/>
+          <w:sz w:val="24"/>
+          <w:szCs w:val="24"/>
+        </w:rPr>
+        <w:t># Guide d'installation du projet</w:t>
+      </w:r>
+    </w:p>
+    <w:p>
+      <w:pPr>
+        <w:rPr>
+          <w:rFonts w:ascii="Times New Roman" w:hAnsi="Times New Roman" w:cs="Times New Roman"/>
+          <w:sz w:val="24"/>
+          <w:szCs w:val="24"/>
+        </w:rPr>
+      </w:pPr>
+    </w:p>
+    <w:p>
+      <w:pPr>
+        <w:rPr>
+          <w:rFonts w:ascii="Times New Roman" w:hAnsi="Times New Roman" w:cs="Times New Roman"/>
+          <w:sz w:val="24"/>
+          <w:szCs w:val="24"/>
+        </w:rPr>
+      </w:pPr>
+      <w:r>
+        <w:rPr>
+          <w:rFonts w:ascii="Times New Roman" w:hAnsi="Times New Roman" w:cs="Times New Roman"/>
+          <w:b/>
+          <w:bCs/>
+          <w:sz w:val="24"/>
+          <w:szCs w:val="24"/>
+        </w:rPr>
+        <w:t xml:space="preserve"> 1. Prérequis</w:t>
+      </w:r>
+    </w:p>
+    <w:p>
+      <w:pPr>
+        <w:rPr>
+          <w:rFonts w:ascii="Times New Roman" w:hAnsi="Times New Roman" w:cs="Times New Roman"/>
+          <w:sz w:val="24"/>
+          <w:szCs w:val="24"/>
+        </w:rPr>
+      </w:pPr>
+      <w:r>
+        <w:rPr>
+          <w:rFonts w:ascii="Times New Roman" w:hAnsi="Times New Roman" w:cs="Times New Roman"/>
+          <w:sz w:val="24"/>
+          <w:szCs w:val="24"/>
+        </w:rPr>
+        <w:t>Avant d'installer le projet, vérifier que les logiciels suivants sont installés :</w:t>
+      </w:r>
+    </w:p>
+    <w:p>
+      <w:pPr>
+        <w:rPr>
+          <w:rFonts w:ascii="Times New Roman" w:hAnsi="Times New Roman" w:cs="Times New Roman"/>
+          <w:sz w:val="24"/>
+          <w:szCs w:val="24"/>
+        </w:rPr>
+      </w:pPr>
+      <w:r>
+        <w:rPr>
+          <w:rFonts w:ascii="Times New Roman" w:hAnsi="Times New Roman" w:cs="Times New Roman"/>
+          <w:sz w:val="24"/>
+          <w:szCs w:val="24"/>
+        </w:rPr>
+        <w:t>- Node.js</w:t>
+      </w:r>
+    </w:p>
+    <w:p>
+      <w:pPr>
+        <w:rPr>
+          <w:rFonts w:ascii="Times New Roman" w:hAnsi="Times New Roman" w:cs="Times New Roman"/>
+          <w:sz w:val="24"/>
+          <w:szCs w:val="24"/>
+        </w:rPr>
+      </w:pPr>
+      <w:r>
+        <w:rPr>
+          <w:rFonts w:ascii="Times New Roman" w:hAnsi="Times New Roman" w:cs="Times New Roman"/>
+          <w:sz w:val="24"/>
+          <w:szCs w:val="24"/>
+        </w:rPr>
+        <w:t>- npm</w:t>
+      </w:r>
+    </w:p>
+    <w:p>
+      <w:pPr>
+        <w:rPr>
+          <w:rFonts w:ascii="Times New Roman" w:hAnsi="Times New Roman" w:cs="Times New Roman"/>
+          <w:sz w:val="24"/>
+          <w:szCs w:val="24"/>
+        </w:rPr>
+      </w:pPr>
+      <w:r>
+        <w:rPr>
+          <w:rFonts w:ascii="Times New Roman" w:hAnsi="Times New Roman" w:cs="Times New Roman"/>
+          <w:sz w:val="24"/>
+          <w:szCs w:val="24"/>
+        </w:rPr>
+        <w:t>- MySQL ou XAMPP/WAMP</w:t>
+      </w:r>
+    </w:p>
+    <w:p>
+      <w:pPr>
+        <w:rPr>
+          <w:rFonts w:ascii="Times New Roman" w:hAnsi="Times New Roman" w:cs="Times New Roman"/>
+          <w:sz w:val="24"/>
+          <w:szCs w:val="24"/>
+        </w:rPr>
+      </w:pPr>
+      <w:r>
+        <w:rPr>
+          <w:rFonts w:ascii="Times New Roman" w:hAnsi="Times New Roman" w:cs="Times New Roman"/>
+          <w:sz w:val="24"/>
+          <w:szCs w:val="24"/>
+        </w:rPr>
+        <w:lastRenderedPageBreak/>
+        <w:t>- Un navigateur web</w:t>
+      </w:r>
+    </w:p>
+    <w:p>
+      <w:pPr>
+        <w:rPr>
+          <w:rFonts w:ascii="Times New Roman" w:hAnsi="Times New Roman" w:cs="Times New Roman"/>
+          <w:sz w:val="24"/>
+          <w:szCs w:val="24"/>
+        </w:rPr>
+      </w:pPr>
+    </w:p>
+    <w:p>
+      <w:pPr>
+        <w:rPr>
+          <w:rFonts w:ascii="Times New Roman" w:hAnsi="Times New Roman" w:cs="Times New Roman"/>
+          <w:sz w:val="24"/>
+          <w:szCs w:val="24"/>
+        </w:rPr>
+      </w:pPr>
+      <w:r>
+        <w:rPr>
+          <w:rFonts w:ascii="Times New Roman" w:hAnsi="Times New Roman" w:cs="Times New Roman"/>
+          <w:b/>
+          <w:bCs/>
+          <w:sz w:val="24"/>
+          <w:szCs w:val="24"/>
+        </w:rPr>
+        <w:t xml:space="preserve"> 2. Base de données</w:t>
+      </w:r>
+    </w:p>
+    <w:p>
+      <w:pPr>
+        <w:rPr>
+          <w:rFonts w:ascii="Times New Roman" w:hAnsi="Times New Roman" w:cs="Times New Roman"/>
+          <w:sz w:val="24"/>
+          <w:szCs w:val="24"/>
+        </w:rPr>
+      </w:pPr>
+      <w:r>
+        <w:rPr>
+          <w:rFonts w:ascii="Times New Roman" w:hAnsi="Times New Roman" w:cs="Times New Roman"/>
+          <w:sz w:val="24"/>
+          <w:szCs w:val="24"/>
+        </w:rPr>
+        <w:t>Le fichier SQL à importer se trouve déjà dans le projet :</w:t>
+      </w:r>
+    </w:p>
+    <w:p>
+      <w:pPr>
+        <w:rPr>
+          <w:rFonts w:ascii="Times New Roman" w:hAnsi="Times New Roman" w:cs="Times New Roman"/>
+          <w:sz w:val="24"/>
+          <w:szCs w:val="24"/>
+        </w:rPr>
+      </w:pPr>
+      <w:r>
+        <w:rPr>
+          <w:rFonts w:ascii="Times New Roman" w:hAnsi="Times New Roman" w:cs="Times New Roman"/>
+          <w:sz w:val="24"/>
+          <w:szCs w:val="24"/>
+        </w:rPr>
+        <w:t>backend/backups/backup_gestprofesseur_2026-05-12.sql</w:t>
+      </w:r>
+    </w:p>
+    <w:p>
+      <w:pPr>
+        <w:rPr>
+          <w:rFonts w:ascii="Times New Roman" w:hAnsi="Times New Roman" w:cs="Times New Roman"/>
+          <w:sz w:val="24"/>
+          <w:szCs w:val="24"/>
+        </w:rPr>
+      </w:pPr>
+      <w:r>
+        <w:rPr>
+          <w:rFonts w:ascii="Times New Roman" w:hAnsi="Times New Roman" w:cs="Times New Roman"/>
+          <w:b/>
+          <w:bCs/>
+          <w:sz w:val="24"/>
+          <w:szCs w:val="24"/>
+        </w:rPr>
+        <w:t xml:space="preserve"> Méthode 1 : import avec phpMyAdmin</w:t>
+      </w:r>
+    </w:p>
+    <w:p>
+      <w:pPr>
+        <w:rPr>
+          <w:rFonts w:ascii="Times New Roman" w:hAnsi="Times New Roman" w:cs="Times New Roman"/>
+          <w:sz w:val="24"/>
+          <w:szCs w:val="24"/>
+        </w:rPr>
+      </w:pPr>
+      <w:r>
+        <w:rPr>
+          <w:rFonts w:ascii="Times New Roman" w:hAnsi="Times New Roman" w:cs="Times New Roman"/>
+          <w:sz w:val="24"/>
+          <w:szCs w:val="24"/>
+        </w:rPr>
+        <w:t>1. Lancer MySQL avec XAMPP ou WAMP.</w:t>
+      </w:r>
+    </w:p>
+    <w:p>
+      <w:pPr>
+        <w:rPr>
+          <w:rFonts w:ascii="Times New Roman" w:hAnsi="Times New Roman" w:cs="Times New Roman"/>
+          <w:sz w:val="24"/>
+          <w:szCs w:val="24"/>
+        </w:rPr>
+      </w:pPr>
+      <w:r>
+        <w:rPr>
+          <w:rFonts w:ascii="Times New Roman" w:hAnsi="Times New Roman" w:cs="Times New Roman"/>
+          <w:sz w:val="24"/>
+          <w:szCs w:val="24"/>
+        </w:rPr>
+        <w:t>2. Ouvrir phpMyAdmin.</w:t>
+      </w:r>
+    </w:p>
+    <w:p>
+      <w:pPr>
+        <w:rPr>
+          <w:rFonts w:ascii="Times New Roman" w:hAnsi="Times New Roman" w:cs="Times New Roman"/>
+          <w:sz w:val="24"/>
+          <w:szCs w:val="24"/>
+        </w:rPr>
+      </w:pPr>
+      <w:r>
+        <w:rPr>
+          <w:rFonts w:ascii="Times New Roman" w:hAnsi="Times New Roman" w:cs="Times New Roman"/>
+          <w:sz w:val="24"/>
+          <w:szCs w:val="24"/>
+        </w:rPr>
+        <w:t>3. Créer une base de données nommée :</w:t>
+      </w:r>
+    </w:p>
+    <w:p>
+      <w:pPr>
+        <w:rPr>
+          <w:rFonts w:ascii="Times New Roman" w:hAnsi="Times New Roman" w:cs="Times New Roman"/>
+          <w:sz w:val="24"/>
+          <w:szCs w:val="24"/>
+        </w:rPr>
+      </w:pPr>
+      <w:r>
+        <w:rPr>
+          <w:rFonts w:ascii="Times New Roman" w:hAnsi="Times New Roman" w:cs="Times New Roman"/>
+          <w:sz w:val="24"/>
+          <w:szCs w:val="24"/>
+        </w:rPr>
+        <w:t>gestprofesseur</w:t>
+      </w:r>
+    </w:p>
+    <w:p>
+      <w:pPr>
+        <w:rPr>
+          <w:rFonts w:ascii="Times New Roman" w:hAnsi="Times New Roman" w:cs="Times New Roman"/>
+          <w:sz w:val="24"/>
+          <w:szCs w:val="24"/>
+        </w:rPr>
+      </w:pPr>
+      <w:r>
+        <w:rPr>
+          <w:rFonts w:ascii="Times New Roman" w:hAnsi="Times New Roman" w:cs="Times New Roman"/>
+          <w:sz w:val="24"/>
+          <w:szCs w:val="24"/>
+        </w:rPr>
+        <w:t>4. Cliquer sur la base `gestprofesseur`.</w:t>
+      </w:r>
+    </w:p>
+    <w:p>
+      <w:pPr>
+        <w:rPr>
+          <w:rFonts w:ascii="Times New Roman" w:hAnsi="Times New Roman" w:cs="Times New Roman"/>
+          <w:sz w:val="24"/>
+          <w:szCs w:val="24"/>
+        </w:rPr>
+      </w:pPr>
+      <w:r>
+        <w:rPr>
+          <w:rFonts w:ascii="Times New Roman" w:hAnsi="Times New Roman" w:cs="Times New Roman"/>
+          <w:sz w:val="24"/>
+          <w:szCs w:val="24"/>
+        </w:rPr>
+        <w:t xml:space="preserve">5. Aller dans l'onglet </w:t>
+      </w:r>
+      <w:r>
+        <w:rPr>
+          <w:rFonts w:ascii="Times New Roman" w:hAnsi="Times New Roman" w:cs="Times New Roman"/>
+          <w:b/>
+          <w:bCs/>
+          <w:sz w:val="24"/>
+          <w:szCs w:val="24"/>
+        </w:rPr>
+        <w:t>Importer</w:t>
+      </w:r>
+      <w:r>
+        <w:rPr>
+          <w:rFonts w:ascii="Times New Roman" w:hAnsi="Times New Roman" w:cs="Times New Roman"/>
+          <w:sz w:val="24"/>
+          <w:szCs w:val="24"/>
+        </w:rPr>
+        <w:t>.</w:t>
+      </w:r>
+    </w:p>
+    <w:p>
+      <w:pPr>
+        <w:rPr>
+          <w:rFonts w:ascii="Times New Roman" w:hAnsi="Times New Roman" w:cs="Times New Roman"/>
+          <w:sz w:val="24"/>
+          <w:szCs w:val="24"/>
+        </w:rPr>
+      </w:pPr>
+      <w:r>
+        <w:rPr>
+          <w:rFonts w:ascii="Times New Roman" w:hAnsi="Times New Roman" w:cs="Times New Roman"/>
+          <w:sz w:val="24"/>
+          <w:szCs w:val="24"/>
+        </w:rPr>
+        <w:t>6. Choisir le fichier :</w:t>
+      </w:r>
+    </w:p>
+    <w:p>
+      <w:pPr>
+        <w:rPr>
+          <w:rFonts w:ascii="Times New Roman" w:hAnsi="Times New Roman" w:cs="Times New Roman"/>
+          <w:sz w:val="24"/>
+          <w:szCs w:val="24"/>
+        </w:rPr>
+      </w:pPr>
+      <w:r>
+        <w:rPr>
+          <w:rFonts w:ascii="Times New Roman" w:hAnsi="Times New Roman" w:cs="Times New Roman"/>
+          <w:sz w:val="24"/>
+          <w:szCs w:val="24"/>
+        </w:rPr>
+        <w:t>backend/backups/backup_gestprofesseur_2026-05-12.sql</w:t>
+      </w:r>
+    </w:p>
+    <w:p>
+      <w:pPr>
+        <w:rPr>
+          <w:rFonts w:ascii="Times New Roman" w:hAnsi="Times New Roman" w:cs="Times New Roman"/>
+          <w:sz w:val="24"/>
+          <w:szCs w:val="24"/>
+        </w:rPr>
+      </w:pPr>
+      <w:r>
+        <w:rPr>
+          <w:rFonts w:ascii="Times New Roman" w:hAnsi="Times New Roman" w:cs="Times New Roman"/>
+          <w:sz w:val="24"/>
+          <w:szCs w:val="24"/>
+        </w:rPr>
+        <w:t xml:space="preserve">7. Cliquer sur </w:t>
+      </w:r>
+      <w:r>
+        <w:rPr>
+          <w:rFonts w:ascii="Times New Roman" w:hAnsi="Times New Roman" w:cs="Times New Roman"/>
+          <w:b/>
+          <w:bCs/>
+          <w:sz w:val="24"/>
+          <w:szCs w:val="24"/>
+        </w:rPr>
+        <w:t>Exécuter</w:t>
+      </w:r>
+      <w:r>
+        <w:rPr>
+          <w:rFonts w:ascii="Times New Roman" w:hAnsi="Times New Roman" w:cs="Times New Roman"/>
+          <w:sz w:val="24"/>
+          <w:szCs w:val="24"/>
+        </w:rPr>
+        <w:t>.</w:t>
+      </w:r>
+    </w:p>
+    <w:p>
+      <w:pPr>
+        <w:rPr>
+          <w:rFonts w:ascii="Times New Roman" w:hAnsi="Times New Roman" w:cs="Times New Roman"/>
+          <w:sz w:val="24"/>
+          <w:szCs w:val="24"/>
+        </w:rPr>
+      </w:pPr>
+    </w:p>
+    <w:p>
+      <w:pPr>
+        <w:rPr>
+          <w:rFonts w:ascii="Times New Roman" w:hAnsi="Times New Roman" w:cs="Times New Roman"/>
+          <w:sz w:val="24"/>
+          <w:szCs w:val="24"/>
+        </w:rPr>
+      </w:pPr>
+      <w:r>
+        <w:rPr>
+          <w:rFonts w:ascii="Times New Roman" w:hAnsi="Times New Roman" w:cs="Times New Roman"/>
+          <w:b/>
+          <w:bCs/>
+          <w:sz w:val="24"/>
+          <w:szCs w:val="24"/>
+        </w:rPr>
+        <w:t xml:space="preserve"> 3. Configuration de la connexion MySQL</w:t>
+      </w:r>
+    </w:p>
+    <w:p>
+      <w:pPr>
+        <w:rPr>
+          <w:rFonts w:ascii="Times New Roman" w:hAnsi="Times New Roman" w:cs="Times New Roman"/>
+          <w:sz w:val="24"/>
+          <w:szCs w:val="24"/>
+        </w:rPr>
+      </w:pPr>
+      <w:r>
+        <w:rPr>
+          <w:rFonts w:ascii="Times New Roman" w:hAnsi="Times New Roman" w:cs="Times New Roman"/>
+          <w:sz w:val="24"/>
+          <w:szCs w:val="24"/>
+        </w:rPr>
+        <w:t>Le fichier de connexion est :</w:t>
+      </w:r>
+    </w:p>
+    <w:p>
+      <w:pPr>
+        <w:rPr>
+          <w:rFonts w:ascii="Times New Roman" w:hAnsi="Times New Roman" w:cs="Times New Roman"/>
+          <w:sz w:val="24"/>
+          <w:szCs w:val="24"/>
+        </w:rPr>
+      </w:pPr>
+      <w:r>
+        <w:rPr>
+          <w:rFonts w:ascii="Times New Roman" w:hAnsi="Times New Roman" w:cs="Times New Roman"/>
+          <w:sz w:val="24"/>
+          <w:szCs w:val="24"/>
+        </w:rPr>
+        <w:t>backend/db.js</w:t>
+      </w:r>
+    </w:p>
+    <w:p>
+      <w:pPr>
+        <w:rPr>
+          <w:rFonts w:ascii="Times New Roman" w:hAnsi="Times New Roman" w:cs="Times New Roman"/>
+          <w:sz w:val="24"/>
+          <w:szCs w:val="24"/>
+        </w:rPr>
+      </w:pPr>
+      <w:r>
+        <w:rPr>
+          <w:rFonts w:ascii="Times New Roman" w:hAnsi="Times New Roman" w:cs="Times New Roman"/>
+          <w:sz w:val="24"/>
+          <w:szCs w:val="24"/>
+        </w:rPr>
+        <w:t>Configuration actuelle :</w:t>
+      </w:r>
+    </w:p>
+    <w:p>
+      <w:pPr>
+        <w:rPr>
+          <w:rFonts w:ascii="Times New Roman" w:hAnsi="Times New Roman" w:cs="Times New Roman"/>
+          <w:sz w:val="24"/>
+          <w:szCs w:val="24"/>
+        </w:rPr>
+      </w:pPr>
+      <w:r>
+        <w:rPr>
+          <w:rFonts w:ascii="Times New Roman" w:hAnsi="Times New Roman" w:cs="Times New Roman"/>
+          <w:sz w:val="24"/>
+          <w:szCs w:val="24"/>
+        </w:rPr>
+        <w:t>host: "127.0.0.1",</w:t>
+      </w:r>
+    </w:p>
+    <w:p>
+      <w:pPr>
+        <w:rPr>
+          <w:rFonts w:ascii="Times New Roman" w:hAnsi="Times New Roman" w:cs="Times New Roman"/>
+          <w:sz w:val="24"/>
+          <w:szCs w:val="24"/>
+        </w:rPr>
+      </w:pPr>
+      <w:r>
+        <w:rPr>
+          <w:rFonts w:ascii="Times New Roman" w:hAnsi="Times New Roman" w:cs="Times New Roman"/>
+          <w:sz w:val="24"/>
+          <w:szCs w:val="24"/>
+        </w:rPr>
+        <w:t>user: "root",</w:t>
+      </w:r>
+    </w:p>
+    <w:p>
+      <w:pPr>
+        <w:rPr>
+          <w:rFonts w:ascii="Times New Roman" w:hAnsi="Times New Roman" w:cs="Times New Roman"/>
+          <w:sz w:val="24"/>
+          <w:szCs w:val="24"/>
+        </w:rPr>
+      </w:pPr>
+      <w:r>
+        <w:rPr>
+          <w:rFonts w:ascii="Times New Roman" w:hAnsi="Times New Roman" w:cs="Times New Roman"/>
+          <w:sz w:val="24"/>
+          <w:szCs w:val="24"/>
+        </w:rPr>
+        <w:t>password: "",</w:t>
+      </w:r>
+    </w:p>
+    <w:p>
+      <w:pPr>
+        <w:rPr>
+          <w:rFonts w:ascii="Times New Roman" w:hAnsi="Times New Roman" w:cs="Times New Roman"/>
+          <w:sz w:val="24"/>
+          <w:szCs w:val="24"/>
+        </w:rPr>
+      </w:pPr>
+      <w:r>
+        <w:rPr>
+          <w:rFonts w:ascii="Times New Roman" w:hAnsi="Times New Roman" w:cs="Times New Roman"/>
+          <w:sz w:val="24"/>
+          <w:szCs w:val="24"/>
+        </w:rPr>
+        <w:t>database: "gestprofesseur",</w:t>
+      </w:r>
+    </w:p>
+    <w:p>
+      <w:pPr>
+        <w:rPr>
+          <w:rFonts w:ascii="Times New Roman" w:hAnsi="Times New Roman" w:cs="Times New Roman"/>
+          <w:sz w:val="24"/>
+          <w:szCs w:val="24"/>
+        </w:rPr>
+      </w:pPr>
+      <w:r>
+        <w:rPr>
+          <w:rFonts w:ascii="Times New Roman" w:hAnsi="Times New Roman" w:cs="Times New Roman"/>
+          <w:sz w:val="24"/>
+          <w:szCs w:val="24"/>
+        </w:rPr>
+        <w:t>port: 3306</w:t>
+      </w:r>
+    </w:p>
+    <w:p>
+      <w:pPr>
+        <w:rPr>
+          <w:rFonts w:ascii="Times New Roman" w:hAnsi="Times New Roman" w:cs="Times New Roman"/>
+          <w:sz w:val="24"/>
+          <w:szCs w:val="24"/>
+        </w:rPr>
+      </w:pPr>
+      <w:r>
+        <w:rPr>
+          <w:rFonts w:ascii="Times New Roman" w:hAnsi="Times New Roman" w:cs="Times New Roman"/>
+          <w:sz w:val="24"/>
+          <w:szCs w:val="24"/>
+        </w:rPr>
+        <w:t>Si MySQL utilise un autre mot de passe, modifier la valeur de `password`.</w:t>
+      </w:r>
+    </w:p>
+    <w:p>
+      <w:pPr>
+        <w:rPr>
+          <w:rFonts w:ascii="Times New Roman" w:hAnsi="Times New Roman" w:cs="Times New Roman"/>
+          <w:sz w:val="24"/>
+          <w:szCs w:val="24"/>
+        </w:rPr>
+      </w:pPr>
+    </w:p>
+    <w:p>
+      <w:pPr>
+        <w:rPr>
+          <w:rFonts w:ascii="Times New Roman" w:hAnsi="Times New Roman" w:cs="Times New Roman"/>
+          <w:sz w:val="24"/>
+          <w:szCs w:val="24"/>
+        </w:rPr>
+      </w:pPr>
+      <w:r>
+        <w:rPr>
+          <w:rFonts w:ascii="Times New Roman" w:hAnsi="Times New Roman" w:cs="Times New Roman"/>
+          <w:b/>
+          <w:bCs/>
+          <w:sz w:val="24"/>
+          <w:szCs w:val="24"/>
+        </w:rPr>
+        <w:t xml:space="preserve"> 4. Installation du backend</w:t>
+      </w:r>
+    </w:p>
+    <w:p>
+      <w:pPr>
+        <w:rPr>
+          <w:rFonts w:ascii="Times New Roman" w:hAnsi="Times New Roman" w:cs="Times New Roman"/>
+          <w:sz w:val="24"/>
+          <w:szCs w:val="24"/>
+        </w:rPr>
+      </w:pPr>
+      <w:r>
+        <w:rPr>
+          <w:rFonts w:ascii="Times New Roman" w:hAnsi="Times New Roman" w:cs="Times New Roman"/>
+          <w:sz w:val="24"/>
+          <w:szCs w:val="24"/>
+        </w:rPr>
+        <w:t>Ouvrir un terminal dans le dossier `backend` :</w:t>
+      </w:r>
+    </w:p>
+    <w:p>
+      <w:pPr>
+        <w:rPr>
+          <w:rFonts w:ascii="Times New Roman" w:hAnsi="Times New Roman" w:cs="Times New Roman"/>
+          <w:sz w:val="24"/>
+          <w:szCs w:val="24"/>
+        </w:rPr>
+      </w:pPr>
+    </w:p>
+    <w:p>
+      <w:pPr>
+        <w:rPr>
+          <w:rFonts w:ascii="Times New Roman" w:hAnsi="Times New Roman" w:cs="Times New Roman"/>
+          <w:sz w:val="24"/>
+          <w:szCs w:val="24"/>
+        </w:rPr>
+      </w:pPr>
+      <w:r>
+        <w:rPr>
+          <w:rFonts w:ascii="Times New Roman" w:hAnsi="Times New Roman" w:cs="Times New Roman"/>
+          <w:sz w:val="24"/>
+          <w:szCs w:val="24"/>
+        </w:rPr>
+        <w:lastRenderedPageBreak/>
+        <w:t>cd backend</w:t>
+      </w:r>
+    </w:p>
+    <w:p>
+      <w:pPr>
+        <w:rPr>
+          <w:rFonts w:ascii="Times New Roman" w:hAnsi="Times New Roman" w:cs="Times New Roman"/>
+          <w:sz w:val="24"/>
+          <w:szCs w:val="24"/>
+        </w:rPr>
+      </w:pPr>
+      <w:r>
+        <w:rPr>
+          <w:rFonts w:ascii="Times New Roman" w:hAnsi="Times New Roman" w:cs="Times New Roman"/>
+          <w:sz w:val="24"/>
+          <w:szCs w:val="24"/>
+        </w:rPr>
+        <w:t>npm install</w:t>
+      </w:r>
+    </w:p>
+    <w:p>
+      <w:pPr>
+        <w:rPr>
+          <w:rFonts w:ascii="Times New Roman" w:hAnsi="Times New Roman" w:cs="Times New Roman"/>
+          <w:sz w:val="24"/>
+          <w:szCs w:val="24"/>
+        </w:rPr>
+      </w:pPr>
+      <w:r>
+        <w:rPr>
+          <w:rFonts w:ascii="Times New Roman" w:hAnsi="Times New Roman" w:cs="Times New Roman"/>
+          <w:sz w:val="24"/>
+          <w:szCs w:val="24"/>
+        </w:rPr>
+        <w:t>Lancer le serveur :</w:t>
+      </w:r>
+    </w:p>
+    <w:p>
+      <w:pPr>
+        <w:rPr>
+          <w:rFonts w:ascii="Times New Roman" w:hAnsi="Times New Roman" w:cs="Times New Roman"/>
+          <w:sz w:val="24"/>
+          <w:szCs w:val="24"/>
+        </w:rPr>
+      </w:pPr>
+      <w:r>
+        <w:rPr>
+          <w:rFonts w:ascii="Times New Roman" w:hAnsi="Times New Roman" w:cs="Times New Roman"/>
+          <w:sz w:val="24"/>
+          <w:szCs w:val="24"/>
+        </w:rPr>
+        <w:t>bash</w:t>
+      </w:r>
+    </w:p>
+    <w:p>
+      <w:pPr>
+        <w:rPr>
+          <w:rFonts w:ascii="Times New Roman" w:hAnsi="Times New Roman" w:cs="Times New Roman"/>
+          <w:sz w:val="24"/>
+          <w:szCs w:val="24"/>
+        </w:rPr>
+      </w:pPr>
+      <w:r>
+        <w:rPr>
+          <w:rFonts w:ascii="Times New Roman" w:hAnsi="Times New Roman" w:cs="Times New Roman"/>
+          <w:sz w:val="24"/>
+          <w:szCs w:val="24"/>
+        </w:rPr>
+        <w:t>npm run dev</w:t>
+      </w:r>
+    </w:p>
+    <w:p>
+      <w:pPr>
+        <w:rPr>
+          <w:rFonts w:ascii="Times New Roman" w:hAnsi="Times New Roman" w:cs="Times New Roman"/>
+          <w:sz w:val="24"/>
+          <w:szCs w:val="24"/>
+        </w:rPr>
+      </w:pPr>
+      <w:r>
+        <w:rPr>
+          <w:rFonts w:ascii="Times New Roman" w:hAnsi="Times New Roman" w:cs="Times New Roman"/>
+          <w:sz w:val="24"/>
+          <w:szCs w:val="24"/>
+        </w:rPr>
+        <w:t>Ou en mode simple :</w:t>
+      </w:r>
+    </w:p>
+    <w:p>
+      <w:pPr>
+        <w:rPr>
+          <w:rFonts w:ascii="Times New Roman" w:hAnsi="Times New Roman" w:cs="Times New Roman"/>
+          <w:sz w:val="24"/>
+          <w:szCs w:val="24"/>
+        </w:rPr>
+      </w:pPr>
+      <w:r>
+        <w:rPr>
+          <w:rFonts w:ascii="Times New Roman" w:hAnsi="Times New Roman" w:cs="Times New Roman"/>
+          <w:sz w:val="24"/>
+          <w:szCs w:val="24"/>
+        </w:rPr>
+        <w:t>bash</w:t>
+      </w:r>
+    </w:p>
+    <w:p>
+      <w:pPr>
+        <w:rPr>
+          <w:rFonts w:ascii="Times New Roman" w:hAnsi="Times New Roman" w:cs="Times New Roman"/>
+          <w:sz w:val="24"/>
+          <w:szCs w:val="24"/>
+        </w:rPr>
+      </w:pPr>
+      <w:r>
+        <w:rPr>
+          <w:rFonts w:ascii="Times New Roman" w:hAnsi="Times New Roman" w:cs="Times New Roman"/>
+          <w:sz w:val="24"/>
+          <w:szCs w:val="24"/>
+        </w:rPr>
+        <w:t>npm start</w:t>
+      </w:r>
+    </w:p>
+    <w:p>
+      <w:pPr>
+        <w:rPr>
+          <w:rFonts w:ascii="Times New Roman" w:hAnsi="Times New Roman" w:cs="Times New Roman"/>
+          <w:sz w:val="24"/>
+          <w:szCs w:val="24"/>
+        </w:rPr>
+      </w:pPr>
+      <w:r>
+        <w:rPr>
+          <w:rFonts w:ascii="Times New Roman" w:hAnsi="Times New Roman" w:cs="Times New Roman"/>
+          <w:sz w:val="24"/>
+          <w:szCs w:val="24"/>
+        </w:rPr>
+        <w:t>Le backend démarre sur :</w:t>
+      </w:r>
+      <w:hyperlink r:id="rId5" w:history="1">
+        <w:r>
+          <w:rPr>
+            <w:rStyle w:val="Lienhypertexte"/>
+            <w:rFonts w:ascii="Times New Roman" w:hAnsi="Times New Roman" w:cs="Times New Roman"/>
+            <w:sz w:val="24"/>
+            <w:szCs w:val="24"/>
+          </w:rPr>
+          <w:t>http://127.0.0.1:3000</w:t>
+        </w:r>
+      </w:hyperlink>
+    </w:p>
+    <w:p>
+      <w:pPr>
+        <w:rPr>
+          <w:rFonts w:ascii="Times New Roman" w:hAnsi="Times New Roman" w:cs="Times New Roman"/>
+          <w:sz w:val="24"/>
+          <w:szCs w:val="24"/>
+        </w:rPr>
+      </w:pPr>
+    </w:p>
+    <w:p>
+      <w:pPr>
+        <w:rPr>
+          <w:rFonts w:ascii="Times New Roman" w:hAnsi="Times New Roman" w:cs="Times New Roman"/>
+          <w:sz w:val="24"/>
+          <w:szCs w:val="24"/>
+        </w:rPr>
+      </w:pPr>
+      <w:r>
+        <w:rPr>
+          <w:rFonts w:ascii="Times New Roman" w:hAnsi="Times New Roman" w:cs="Times New Roman"/>
+          <w:b/>
+          <w:bCs/>
+          <w:sz w:val="24"/>
+          <w:szCs w:val="24"/>
+        </w:rPr>
+        <w:t xml:space="preserve"> 5. Installation du frontend</w:t>
+      </w:r>
+    </w:p>
+    <w:p>
+      <w:pPr>
+        <w:rPr>
+          <w:rFonts w:ascii="Times New Roman" w:hAnsi="Times New Roman" w:cs="Times New Roman"/>
+          <w:sz w:val="24"/>
+          <w:szCs w:val="24"/>
+        </w:rPr>
+      </w:pPr>
+      <w:r>
+        <w:rPr>
+          <w:rFonts w:ascii="Times New Roman" w:hAnsi="Times New Roman" w:cs="Times New Roman"/>
+          <w:sz w:val="24"/>
+          <w:szCs w:val="24"/>
+        </w:rPr>
+        <w:t>Ouvrir un deuxième terminal dans le dossier `frontend` :</w:t>
+      </w:r>
+    </w:p>
+    <w:p>
+      <w:pPr>
+        <w:rPr>
+          <w:rFonts w:ascii="Times New Roman" w:hAnsi="Times New Roman" w:cs="Times New Roman"/>
+          <w:sz w:val="24"/>
+          <w:szCs w:val="24"/>
+        </w:rPr>
+      </w:pPr>
+      <w:r>
+        <w:rPr>
+          <w:rFonts w:ascii="Times New Roman" w:hAnsi="Times New Roman" w:cs="Times New Roman"/>
+          <w:sz w:val="24"/>
+          <w:szCs w:val="24"/>
+        </w:rPr>
+        <w:t>cd frontend</w:t>
+      </w:r>
+    </w:p>
+    <w:p>
+      <w:pPr>
+        <w:rPr>
+          <w:rFonts w:ascii="Times New Roman" w:hAnsi="Times New Roman" w:cs="Times New Roman"/>
+          <w:sz w:val="24"/>
+          <w:szCs w:val="24"/>
+        </w:rPr>
+      </w:pPr>
+      <w:r>
+        <w:rPr>
+          <w:rFonts w:ascii="Times New Roman" w:hAnsi="Times New Roman" w:cs="Times New Roman"/>
+          <w:sz w:val="24"/>
+          <w:szCs w:val="24"/>
+        </w:rPr>
+        <w:t>npm install</w:t>
+      </w:r>
+    </w:p>
+    <w:p>
+      <w:pPr>
+        <w:rPr>
+          <w:rFonts w:ascii="Times New Roman" w:hAnsi="Times New Roman" w:cs="Times New Roman"/>
+          <w:sz w:val="24"/>
+          <w:szCs w:val="24"/>
+        </w:rPr>
+      </w:pPr>
+      <w:r>
+        <w:rPr>
+          <w:rFonts w:ascii="Times New Roman" w:hAnsi="Times New Roman" w:cs="Times New Roman"/>
+          <w:sz w:val="24"/>
+          <w:szCs w:val="24"/>
+        </w:rPr>
+        <w:t>npm run dev</w:t>
+      </w:r>
+    </w:p>
+    <w:p>
+      <w:pPr>
+        <w:rPr>
+          <w:rFonts w:ascii="Times New Roman" w:hAnsi="Times New Roman" w:cs="Times New Roman"/>
+          <w:sz w:val="24"/>
+          <w:szCs w:val="24"/>
+        </w:rPr>
+      </w:pPr>
+      <w:r>
+        <w:rPr>
+          <w:rFonts w:ascii="Times New Roman" w:hAnsi="Times New Roman" w:cs="Times New Roman"/>
+          <w:sz w:val="24"/>
+          <w:szCs w:val="24"/>
+        </w:rPr>
+        <w:t>Le frontend démarre généralement sur :</w:t>
+      </w:r>
+    </w:p>
+    <w:p>
+      <w:pPr>
+        <w:rPr>
+          <w:rFonts w:ascii="Times New Roman" w:hAnsi="Times New Roman" w:cs="Times New Roman"/>
+          <w:sz w:val="24"/>
+          <w:szCs w:val="24"/>
+        </w:rPr>
+      </w:pPr>
+      <w:r>
+        <w:rPr>
+          <w:rFonts w:ascii="Times New Roman" w:hAnsi="Times New Roman" w:cs="Times New Roman"/>
+          <w:sz w:val="24"/>
+          <w:szCs w:val="24"/>
+        </w:rPr>
+        <w:t>http://localhost:5173</w:t>
+      </w:r>
+    </w:p>
+    <w:p>
+      <w:pPr>
+        <w:rPr>
+          <w:rFonts w:ascii="Times New Roman" w:hAnsi="Times New Roman" w:cs="Times New Roman"/>
+          <w:sz w:val="24"/>
+          <w:szCs w:val="24"/>
+        </w:rPr>
+      </w:pPr>
+      <w:r>
+        <w:rPr>
+          <w:rFonts w:ascii="Times New Roman" w:hAnsi="Times New Roman" w:cs="Times New Roman"/>
+          <w:sz w:val="24"/>
+          <w:szCs w:val="24"/>
+        </w:rPr>
+        <w:t>Ouvrir cette adresse dans le navigateur.</w:t>
+      </w:r>
+    </w:p>
+    <w:p>
+      <w:pPr>
+        <w:rPr>
+          <w:rFonts w:ascii="Times New Roman" w:hAnsi="Times New Roman" w:cs="Times New Roman"/>
+          <w:sz w:val="24"/>
+          <w:szCs w:val="24"/>
+        </w:rPr>
+      </w:pPr>
+    </w:p>
+    <w:p>
+      <w:pPr>
+        <w:rPr>
+          <w:rFonts w:ascii="Times New Roman" w:hAnsi="Times New Roman" w:cs="Times New Roman"/>
+          <w:sz w:val="24"/>
+          <w:szCs w:val="24"/>
+        </w:rPr>
+      </w:pPr>
+      <w:r>
+        <w:rPr>
+          <w:rFonts w:ascii="Times New Roman" w:hAnsi="Times New Roman" w:cs="Times New Roman"/>
+          <w:b/>
+          <w:bCs/>
+          <w:sz w:val="24"/>
+          <w:szCs w:val="24"/>
+        </w:rPr>
+        <w:t xml:space="preserve"> 7. Ordre de lancement recommandé</w:t>
+      </w:r>
+    </w:p>
+    <w:p>
+      <w:pPr>
+        <w:rPr>
+          <w:rFonts w:ascii="Times New Roman" w:hAnsi="Times New Roman" w:cs="Times New Roman"/>
+          <w:sz w:val="24"/>
+          <w:szCs w:val="24"/>
+        </w:rPr>
+      </w:pPr>
+      <w:r>
+        <w:rPr>
+          <w:rFonts w:ascii="Times New Roman" w:hAnsi="Times New Roman" w:cs="Times New Roman"/>
+          <w:sz w:val="24"/>
+          <w:szCs w:val="24"/>
+        </w:rPr>
+        <w:t>1. Lancer MySQL.</w:t>
+      </w:r>
+    </w:p>
+    <w:p>
+      <w:pPr>
+        <w:rPr>
+          <w:rFonts w:ascii="Times New Roman" w:hAnsi="Times New Roman" w:cs="Times New Roman"/>
+          <w:sz w:val="24"/>
+          <w:szCs w:val="24"/>
+        </w:rPr>
+      </w:pPr>
+      <w:r>
+        <w:rPr>
+          <w:rFonts w:ascii="Times New Roman" w:hAnsi="Times New Roman" w:cs="Times New Roman"/>
+          <w:sz w:val="24"/>
+          <w:szCs w:val="24"/>
+        </w:rPr>
+        <w:t>2. Importer la base `gestprofesseur`.</w:t>
+      </w:r>
+    </w:p>
+    <w:p>
+      <w:pPr>
+        <w:rPr>
+          <w:rFonts w:ascii="Times New Roman" w:hAnsi="Times New Roman" w:cs="Times New Roman"/>
+          <w:sz w:val="24"/>
+          <w:szCs w:val="24"/>
+        </w:rPr>
+      </w:pPr>
+      <w:r>
+        <w:rPr>
+          <w:rFonts w:ascii="Times New Roman" w:hAnsi="Times New Roman" w:cs="Times New Roman"/>
+          <w:sz w:val="24"/>
+          <w:szCs w:val="24"/>
+        </w:rPr>
+        <w:t>3. Installer et lancer le backend.</w:t>
+      </w:r>
+    </w:p>
+    <w:p>
+      <w:pPr>
+        <w:rPr>
+          <w:rFonts w:ascii="Times New Roman" w:hAnsi="Times New Roman" w:cs="Times New Roman"/>
+          <w:sz w:val="24"/>
+          <w:szCs w:val="24"/>
+        </w:rPr>
+      </w:pPr>
+      <w:r>
+        <w:rPr>
+          <w:rFonts w:ascii="Times New Roman" w:hAnsi="Times New Roman" w:cs="Times New Roman"/>
+          <w:sz w:val="24"/>
+          <w:szCs w:val="24"/>
+        </w:rPr>
+        <w:t>4. Installer et lancer le frontend.</w:t>
+      </w:r>
+    </w:p>
+    <w:p>
+      <w:pPr>
+        <w:rPr>
+          <w:rFonts w:ascii="Times New Roman" w:hAnsi="Times New Roman" w:cs="Times New Roman"/>
+          <w:sz w:val="24"/>
+          <w:szCs w:val="24"/>
+        </w:rPr>
+      </w:pPr>
+      <w:r>
+        <w:rPr>
+          <w:rFonts w:ascii="Times New Roman" w:hAnsi="Times New Roman" w:cs="Times New Roman"/>
+          <w:sz w:val="24"/>
+          <w:szCs w:val="24"/>
+        </w:rPr>
+        <w:t>5. Ouvrir `http://localhost:5173`.</w:t>
+      </w:r>
+    </w:p>
+    <w:p>
+      <w:pPr>
+        <w:rPr>
+          <w:rFonts w:ascii="Times New Roman" w:hAnsi="Times New Roman" w:cs="Times New Roman"/>
+          <w:sz w:val="24"/>
+          <w:szCs w:val="24"/>
+        </w:rPr>
+      </w:pPr>
+    </w:p>
+    <w:p>
+      <w:pPr>
+        <w:rPr>
+          <w:rFonts w:ascii="Times New Roman" w:hAnsi="Times New Roman" w:cs="Times New Roman"/>
+          <w:sz w:val="24"/>
+          <w:szCs w:val="24"/>
+        </w:rPr>
+      </w:pPr>
+      <w:r>
+        <w:rPr>
+          <w:rFonts w:ascii="Times New Roman" w:hAnsi="Times New Roman" w:cs="Times New Roman"/>
+          <w:b/>
+          <w:bCs/>
+          <w:sz w:val="24"/>
+          <w:szCs w:val="24"/>
+        </w:rPr>
+        <w:t xml:space="preserve"> 8. Vérification rapide</w:t>
+      </w:r>
+    </w:p>
+    <w:p>
+      <w:pPr>
+        <w:rPr>
+          <w:rFonts w:ascii="Times New Roman" w:hAnsi="Times New Roman" w:cs="Times New Roman"/>
+          <w:sz w:val="24"/>
+          <w:szCs w:val="24"/>
+        </w:rPr>
+      </w:pPr>
+      <w:r>
+        <w:rPr>
+          <w:rFonts w:ascii="Times New Roman" w:hAnsi="Times New Roman" w:cs="Times New Roman"/>
+          <w:sz w:val="24"/>
+          <w:szCs w:val="24"/>
+        </w:rPr>
+        <w:t>Après lancement du backend, le terminal doit afficher une connexion réussie à la base de données et le serveur doit être disponible sur le port `3000`.</w:t>
+      </w:r>
+    </w:p>
+    <w:p>
+      <w:pPr>
+        <w:rPr>
+          <w:rFonts w:ascii="Times New Roman" w:hAnsi="Times New Roman" w:cs="Times New Roman"/>
+          <w:sz w:val="24"/>
+          <w:szCs w:val="24"/>
+        </w:rPr>
+      </w:pPr>
+      <w:r>
+        <w:rPr>
+          <w:rFonts w:ascii="Times New Roman" w:hAnsi="Times New Roman" w:cs="Times New Roman"/>
+          <w:sz w:val="24"/>
+          <w:szCs w:val="24"/>
+        </w:rPr>
+        <w:t>Après lancement du frontend, la page de connexion de l'application doit s'afficher dans le navigateur.</w:t>
+      </w:r>
+    </w:p>
+    <w:p>
+      <w:pPr>
+        <w:rPr>
+          <w:rFonts w:ascii="Times New Roman" w:hAnsi="Times New Roman" w:cs="Times New Roman"/>
+          <w:sz w:val="24"/>
+          <w:szCs w:val="24"/>
+        </w:rPr>
+      </w:pPr>
+      <w:r>
+        <w:rPr>
+          <w:rFonts w:ascii="Times New Roman" w:hAnsi="Times New Roman" w:cs="Times New Roman"/>
+          <w:b/>
+          <w:bCs/>
+          <w:sz w:val="24"/>
+          <w:szCs w:val="24"/>
+        </w:rPr>
+        <w:lastRenderedPageBreak/>
+        <w:t xml:space="preserve"> 9. Problèmes fréquents</w:t>
+      </w:r>
+    </w:p>
+    <w:p>
+      <w:pPr>
+        <w:rPr>
+          <w:rFonts w:ascii="Times New Roman" w:hAnsi="Times New Roman" w:cs="Times New Roman"/>
+          <w:sz w:val="24"/>
+          <w:szCs w:val="24"/>
+        </w:rPr>
+      </w:pPr>
+    </w:p>
+    <w:p>
+      <w:pPr>
+        <w:rPr>
+          <w:rFonts w:ascii="Times New Roman" w:hAnsi="Times New Roman" w:cs="Times New Roman"/>
+          <w:sz w:val="24"/>
+          <w:szCs w:val="24"/>
+        </w:rPr>
+      </w:pPr>
+      <w:r>
+        <w:rPr>
+          <w:rFonts w:ascii="Times New Roman" w:hAnsi="Times New Roman" w:cs="Times New Roman"/>
+          <w:b/>
+          <w:bCs/>
+          <w:sz w:val="24"/>
+          <w:szCs w:val="24"/>
+        </w:rPr>
+        <w:t xml:space="preserve"> Erreur de connexion à la base de données</w:t>
+      </w:r>
+    </w:p>
+    <w:p>
+      <w:pPr>
+        <w:rPr>
+          <w:rFonts w:ascii="Times New Roman" w:hAnsi="Times New Roman" w:cs="Times New Roman"/>
+          <w:sz w:val="24"/>
+          <w:szCs w:val="24"/>
+        </w:rPr>
+      </w:pPr>
+      <w:r>
+        <w:rPr>
+          <w:rFonts w:ascii="Times New Roman" w:hAnsi="Times New Roman" w:cs="Times New Roman"/>
+          <w:sz w:val="24"/>
+          <w:szCs w:val="24"/>
+        </w:rPr>
+        <w:t>Vérifier :</w:t>
+      </w:r>
+    </w:p>
+    <w:p>
+      <w:pPr>
+        <w:rPr>
+          <w:rFonts w:ascii="Times New Roman" w:hAnsi="Times New Roman" w:cs="Times New Roman"/>
+          <w:sz w:val="24"/>
+          <w:szCs w:val="24"/>
+        </w:rPr>
+      </w:pPr>
+      <w:r>
+        <w:rPr>
+          <w:rFonts w:ascii="Times New Roman" w:hAnsi="Times New Roman" w:cs="Times New Roman"/>
+          <w:sz w:val="24"/>
+          <w:szCs w:val="24"/>
+        </w:rPr>
+        <w:t>- MySQL est lancé.</w:t>
+      </w:r>
+    </w:p>
+    <w:p>
+      <w:pPr>
+        <w:rPr>
+          <w:rFonts w:ascii="Times New Roman" w:hAnsi="Times New Roman" w:cs="Times New Roman"/>
+          <w:sz w:val="24"/>
+          <w:szCs w:val="24"/>
+        </w:rPr>
+      </w:pPr>
+      <w:r>
+        <w:rPr>
+          <w:rFonts w:ascii="Times New Roman" w:hAnsi="Times New Roman" w:cs="Times New Roman"/>
+          <w:sz w:val="24"/>
+          <w:szCs w:val="24"/>
+        </w:rPr>
+        <w:t>- La base `gestprofesseur` existe.</w:t>
+      </w:r>
+    </w:p>
+    <w:p>
+      <w:pPr>
+        <w:rPr>
+          <w:rFonts w:ascii="Times New Roman" w:hAnsi="Times New Roman" w:cs="Times New Roman"/>
+          <w:sz w:val="24"/>
+          <w:szCs w:val="24"/>
+        </w:rPr>
+      </w:pPr>
+      <w:r>
+        <w:rPr>
+          <w:rFonts w:ascii="Times New Roman" w:hAnsi="Times New Roman" w:cs="Times New Roman"/>
+          <w:sz w:val="24"/>
+          <w:szCs w:val="24"/>
+        </w:rPr>
+        <w:t>- Le mot de passe dans `backend/db.js` est correct.</w:t>
+      </w:r>
+    </w:p>
+    <w:p>
+      <w:pPr>
+        <w:rPr>
+          <w:rFonts w:ascii="Times New Roman" w:hAnsi="Times New Roman" w:cs="Times New Roman"/>
+          <w:sz w:val="24"/>
+          <w:szCs w:val="24"/>
+        </w:rPr>
+      </w:pPr>
+      <w:r>
+        <w:rPr>
+          <w:rFonts w:ascii="Times New Roman" w:hAnsi="Times New Roman" w:cs="Times New Roman"/>
+          <w:sz w:val="24"/>
+          <w:szCs w:val="24"/>
+        </w:rPr>
+        <w:t>- Le port MySQL est bien `3306`.</w:t>
+      </w:r>
+    </w:p>
+    <w:p>
+      <w:pPr>
+        <w:rPr>
+          <w:rFonts w:ascii="Times New Roman" w:hAnsi="Times New Roman" w:cs="Times New Roman"/>
+          <w:sz w:val="24"/>
+          <w:szCs w:val="24"/>
+        </w:rPr>
+      </w:pPr>
+    </w:p>
+    <w:p>
+      <w:pPr>
+        <w:rPr>
+          <w:rFonts w:ascii="Times New Roman" w:hAnsi="Times New Roman" w:cs="Times New Roman"/>
+          <w:sz w:val="24"/>
+          <w:szCs w:val="24"/>
+        </w:rPr>
+      </w:pPr>
+      <w:r>
+        <w:rPr>
+          <w:rFonts w:ascii="Times New Roman" w:hAnsi="Times New Roman" w:cs="Times New Roman"/>
+          <w:b/>
+          <w:bCs/>
+          <w:sz w:val="24"/>
+          <w:szCs w:val="24"/>
+        </w:rPr>
+        <w:t xml:space="preserve"> Le frontend ne contacte pas le backend</w:t>
+      </w:r>
+    </w:p>
+    <w:p>
+      <w:pPr>
+        <w:rPr>
+          <w:rFonts w:ascii="Times New Roman" w:hAnsi="Times New Roman" w:cs="Times New Roman"/>
+          <w:sz w:val="24"/>
+          <w:szCs w:val="24"/>
+        </w:rPr>
+      </w:pPr>
+    </w:p>
+    <w:p>
+      <w:pPr>
+        <w:rPr>
+          <w:rFonts w:ascii="Times New Roman" w:hAnsi="Times New Roman" w:cs="Times New Roman"/>
+          <w:sz w:val="24"/>
+          <w:szCs w:val="24"/>
+        </w:rPr>
+      </w:pPr>
+      <w:r>
+        <w:rPr>
+          <w:rFonts w:ascii="Times New Roman" w:hAnsi="Times New Roman" w:cs="Times New Roman"/>
+          <w:sz w:val="24"/>
+          <w:szCs w:val="24"/>
+        </w:rPr>
+        <w:t>Vérifier que le backend est lancé sur :</w:t>
+      </w:r>
+    </w:p>
+    <w:p>
+      <w:pPr>
+        <w:rPr>
+          <w:rFonts w:ascii="Times New Roman" w:hAnsi="Times New Roman" w:cs="Times New Roman"/>
+          <w:sz w:val="24"/>
+          <w:szCs w:val="24"/>
+        </w:rPr>
+      </w:pPr>
+      <w:r>
+        <w:rPr>
+          <w:rFonts w:ascii="Times New Roman" w:hAnsi="Times New Roman" w:cs="Times New Roman"/>
+          <w:sz w:val="24"/>
+          <w:szCs w:val="24"/>
+        </w:rPr>
+        <w:t>http://127.0.0.1:3000</w:t>
+      </w:r>
+    </w:p>
+    <w:p>
+      <w:pPr>
+        <w:rPr>
+          <w:rFonts w:ascii="Times New Roman" w:hAnsi="Times New Roman" w:cs="Times New Roman"/>
+          <w:sz w:val="24"/>
+          <w:szCs w:val="24"/>
+        </w:rPr>
+      </w:pPr>
+      <w:r>
+        <w:rPr>
+          <w:rFonts w:ascii="Times New Roman" w:hAnsi="Times New Roman" w:cs="Times New Roman"/>
+          <w:b/>
+          <w:bCs/>
+          <w:sz w:val="24"/>
+          <w:szCs w:val="24"/>
+        </w:rPr>
+        <w:t xml:space="preserve"> Port déjà utilisé</w:t>
+      </w:r>
+    </w:p>
+    <w:p>
+      <w:pPr>
+        <w:rPr>
+          <w:rFonts w:ascii="Times New Roman" w:hAnsi="Times New Roman" w:cs="Times New Roman"/>
+          <w:sz w:val="24"/>
+          <w:szCs w:val="24"/>
+        </w:rPr>
+      </w:pPr>
+      <w:r>
+        <w:rPr>
+          <w:rFonts w:ascii="Times New Roman" w:hAnsi="Times New Roman" w:cs="Times New Roman"/>
+          <w:sz w:val="24"/>
+          <w:szCs w:val="24"/>
+        </w:rPr>
+        <w:t>Fermer l'ancien serveur ou lancer l'application sur un autre port.</w:t>
+      </w:r>
+    </w:p>
+    <w:p>
+      <w:pPr>
+        <w:rPr>
+          <w:rFonts w:ascii="Times New Roman" w:hAnsi="Times New Roman" w:cs="Times New Roman"/>
           <w:sz w:val="24"/>
           <w:szCs w:val="24"/>
         </w:rPr>
@@ -8841,6 +10224,119 @@
         </w:tabs>
         <w:ind w:left="6480" w:hanging="720"/>
       </w:pPr>
+    </w:lvl>
+  </w:abstractNum>
+  <w:abstractNum w:abstractNumId="4" w15:restartNumberingAfterBreak="0">
+    <w:nsid w:val="75FB721B"/>
+    <w:multiLevelType w:val="hybridMultilevel"/>
+    <w:tmpl w:val="FAE83A2E"/>
+    <w:lvl w:ilvl="0" w:tplc="040C0001">
+      <w:start w:val="1"/>
+      <w:numFmt w:val="bullet"/>
+      <w:lvlText w:val=""/>
+      <w:lvlJc w:val="left"/>
+      <w:pPr>
+        <w:ind w:left="778" w:hanging="360"/>
+      </w:pPr>
+      <w:rPr>
+        <w:rFonts w:ascii="Symbol" w:hAnsi="Symbol" w:hint="default"/>
+      </w:rPr>
+    </w:lvl>
+    <w:lvl w:ilvl="1" w:tplc="040C0003" w:tentative="1">
+      <w:start w:val="1"/>
+      <w:numFmt w:val="bullet"/>
+      <w:lvlText w:val="o"/>
+      <w:lvlJc w:val="left"/>
+      <w:pPr>
+        <w:ind w:left="1498" w:hanging="360"/>
+      </w:pPr>
+      <w:rPr>
+        <w:rFonts w:ascii="Courier New" w:hAnsi="Courier New" w:cs="Courier New" w:hint="default"/>
+      </w:rPr>
+    </w:lvl>
+    <w:lvl w:ilvl="2" w:tplc="040C0005" w:tentative="1">
+      <w:start w:val="1"/>
+      <w:numFmt w:val="bullet"/>
+      <w:lvlText w:val=""/>
+      <w:lvlJc w:val="left"/>
+      <w:pPr>
+        <w:ind w:left="2218" w:hanging="360"/>
+      </w:pPr>
+      <w:rPr>
+        <w:rFonts w:ascii="Wingdings" w:hAnsi="Wingdings" w:hint="default"/>
+      </w:rPr>
+    </w:lvl>
+    <w:lvl w:ilvl="3" w:tplc="040C0001" w:tentative="1">
+      <w:start w:val="1"/>
+      <w:numFmt w:val="bullet"/>
+      <w:lvlText w:val=""/>
+      <w:lvlJc w:val="left"/>
+      <w:pPr>
+        <w:ind w:left="2938" w:hanging="360"/>
+      </w:pPr>
+      <w:rPr>
+        <w:rFonts w:ascii="Symbol" w:hAnsi="Symbol" w:hint="default"/>
+      </w:rPr>
+    </w:lvl>
+    <w:lvl w:ilvl="4" w:tplc="040C0003" w:tentative="1">
+      <w:start w:val="1"/>
+      <w:numFmt w:val="bullet"/>
+      <w:lvlText w:val="o"/>
+      <w:lvlJc w:val="left"/>
+      <w:pPr>
+        <w:ind w:left="3658" w:hanging="360"/>
+      </w:pPr>
+      <w:rPr>
+        <w:rFonts w:ascii="Courier New" w:hAnsi="Courier New" w:cs="Courier New" w:hint="default"/>
+      </w:rPr>
+    </w:lvl>
+    <w:lvl w:ilvl="5" w:tplc="040C0005" w:tentative="1">
+      <w:start w:val="1"/>
+      <w:numFmt w:val="bullet"/>
+      <w:lvlText w:val=""/>
+      <w:lvlJc w:val="left"/>
+      <w:pPr>
+        <w:ind w:left="4378" w:hanging="360"/>
+      </w:pPr>
+      <w:rPr>
+        <w:rFonts w:ascii="Wingdings" w:hAnsi="Wingdings" w:hint="default"/>
+      </w:rPr>
+    </w:lvl>
+    <w:lvl w:ilvl="6" w:tplc="040C0001" w:tentative="1">
+      <w:start w:val="1"/>
+      <w:numFmt w:val="bullet"/>
+      <w:lvlText w:val=""/>
+      <w:lvlJc w:val="left"/>
+      <w:pPr>
+        <w:ind w:left="5098" w:hanging="360"/>
+      </w:pPr>
+      <w:rPr>
+        <w:rFonts w:ascii="Symbol" w:hAnsi="Symbol" w:hint="default"/>
+      </w:rPr>
+    </w:lvl>
+    <w:lvl w:ilvl="7" w:tplc="040C0003" w:tentative="1">
+      <w:start w:val="1"/>
+      <w:numFmt w:val="bullet"/>
+      <w:lvlText w:val="o"/>
+      <w:lvlJc w:val="left"/>
+      <w:pPr>
+        <w:ind w:left="5818" w:hanging="360"/>
+      </w:pPr>
+      <w:rPr>
+        <w:rFonts w:ascii="Courier New" w:hAnsi="Courier New" w:cs="Courier New" w:hint="default"/>
+      </w:rPr>
+    </w:lvl>
+    <w:lvl w:ilvl="8" w:tplc="040C0005" w:tentative="1">
+      <w:start w:val="1"/>
+      <w:numFmt w:val="bullet"/>
+      <w:lvlText w:val=""/>
+      <w:lvlJc w:val="left"/>
+      <w:pPr>
+        <w:ind w:left="6538" w:hanging="360"/>
+      </w:pPr>
+      <w:rPr>
+        <w:rFonts w:ascii="Wingdings" w:hAnsi="Wingdings" w:hint="default"/>
+      </w:rPr>
     </w:lvl>
   </w:abstractNum>
   <w:num w:numId="1" w16cid:durableId="1028095934">
@@ -8914,6 +10410,9 @@
     <w:lvlOverride w:ilvl="8">
       <w:startOverride w:val="1"/>
     </w:lvlOverride>
+  </w:num>
+  <w:num w:numId="7" w16cid:durableId="2137681119">
+    <w:abstractNumId w:val="4"/>
   </w:num>
 </w:numbering>
 </file>
@@ -9881,6 +11380,29 @@
       <w14:ligatures w14:val="none"/>
     </w:rPr>
   </w:style>
+  <w:style w:type="character" w:styleId="Lienhypertexte">
+    <w:name w:val="Hyperlink"/>
+    <w:basedOn w:val="Policepardfaut"/>
+    <w:uiPriority w:val="99"/>
+    <w:unhideWhenUsed/>
+    <w:rsid w:val="00825FA3"/>
+    <w:rPr>
+      <w:color w:val="0563C1" w:themeColor="hyperlink"/>
+      <w:u w:val="single"/>
+    </w:rPr>
+  </w:style>
+  <w:style w:type="character" w:styleId="Mentionnonrsolue">
+    <w:name w:val="Unresolved Mention"/>
+    <w:basedOn w:val="Policepardfaut"/>
+    <w:uiPriority w:val="99"/>
+    <w:semiHidden/>
+    <w:unhideWhenUsed/>
+    <w:rsid w:val="00825FA3"/>
+    <w:rPr>
+      <w:color w:val="605E5C"/>
+      <w:shd w:val="clear" w:color="auto" w:fill="E1DFDD"/>
+    </w:rPr>
+  </w:style>
 </w:styles>
 </file>
 

</xml_diff>